<commit_message>
docs: write project materials in team voice and refresh report
</commit_message>
<xml_diff>
--- a/docs/ScreenMentor_Project_Report.docx
+++ b/docs/ScreenMentor_Project_Report.docx
@@ -77,15 +77,9 @@
     <w:p>
       <w:r>
         <w:rPr>
-          <w:b/>
-        </w:rPr>
-        <w:t>Назначение отчёта.</w:t>
-      </w:r>
-      <w:r>
-        <w:rPr>
           <w:b w:val="0"/>
         </w:rPr>
-        <w:t xml:space="preserve"> Представить жюри и владельцу задачи работающий прототип, объяснить аналитический подход и показать, как детали интерфейса, обработки данных и выгрузок поддерживают проверку результатов.</w:t>
+        <w:t>Мы разработали «Граф денег», чтобы помочь AML-аналитику разобраться в сети переводов. В отчёте показываем, как работает решение, почему мы выбрали такой интерфейс и как проверяем результаты.</w:t>
       </w:r>
     </w:p>
     <w:p>
@@ -107,7 +101,7 @@
         <w:rPr>
           <w:b w:val="0"/>
         </w:rPr>
-        <w:t xml:space="preserve"> Основной сценарий реализован и проверен на полном наборе кейса. Выводы остаются гипотезами: проект помогает выбрать направление проверки и не устанавливает нарушение.</w:t>
+        <w:t xml:space="preserve"> Мы реализовали основной сценарий и проверили его на полном наборе кейса. Выводы остаются гипотезами: проект помогает выбрать направление проверки и не устанавливает нарушение.</w:t>
       </w:r>
     </w:p>
     <w:tbl>
@@ -294,7 +288,15 @@
         <w:rPr>
           <w:b w:val="0"/>
         </w:rPr>
-        <w:t>Метод 1.1.0 · функциональная версия 78fb39f · Windows · Python 3.12</w:t>
+        <w:t>Наш сайт: https://screenmentor-uwfohh6hz.gobrev.dev</w:t>
+      </w:r>
+    </w:p>
+    <w:p>
+      <w:r>
+        <w:rPr>
+          <w:b w:val="0"/>
+        </w:rPr>
+        <w:t>Публичное демо без регистрации и пароля · Метод 1.1.0 · Python 3.12</w:t>
       </w:r>
     </w:p>
     <w:p>
@@ -688,7 +690,7 @@
         <w:rPr>
           <w:b w:val="0"/>
         </w:rPr>
-        <w:t>Языковая модель в работающем приложении не используется. Локальный помощник отвечает на четыре готовые темы по рассчитанным фактам. Codex использовался при разработке и тестировании; зависимости и использованные материалы раскрыты в README.</w:t>
+        <w:t>Языковая модель в работающем приложении не используется. Локальный помощник отвечает на четыре готовые темы по рассчитанным фактам. При разработке и тестировании мы использовали Codex; зависимости и использованные материалы раскрыты в README.</w:t>
       </w:r>
     </w:p>
     <w:p>
@@ -709,7 +711,7 @@
         <w:rPr>
           <w:b w:val="0"/>
         </w:rPr>
-        <w:t xml:space="preserve">Экран построен вокруг трёх действий: </w:t>
+        <w:t xml:space="preserve">Мы построили экран вокруг трёх действий: </w:t>
       </w:r>
       <w:r>
         <w:rPr>
@@ -915,7 +917,7 @@
         <w:rPr>
           <w:b w:val="0"/>
         </w:rPr>
-        <w:t>Надёжность результата начинается с проверки входа. Проект сверяет схемы, типы, ссылки, уникальность счетов и агрегированных пар, даты, суммы и число переводов. Агрегаты сравниваются с отдельными операциями в целых тиынах.</w:t>
+        <w:t>Мы начинаем обработку с проверки входных файлов. Приложение сверяет схемы, типы, ссылки, уникальность счетов и агрегированных пар, даты, суммы и число переводов. Агрегаты сравниваются с отдельными операциями в целых тиынах.</w:t>
       </w:r>
     </w:p>
     <w:tbl>
@@ -3025,13 +3027,13 @@
         <w:rPr>
           <w:b/>
         </w:rPr>
-        <w:t>Пределы доказательств.</w:t>
+        <w:t>Что нам ещё предстоит проверить.</w:t>
       </w:r>
       <w:r>
         <w:rPr>
           <w:b w:val="0"/>
         </w:rPr>
-        <w:t xml:space="preserve"> Размеченных ролей нет, поэтому accuracy и F1 не заявляются. Исследование с AML-аналитиками и замер экономии времени ещё не проводились. Успешные тесты не означают отсутствие любых ошибок на неизвестных входах.</w:t>
+        <w:t xml:space="preserve"> В наборе нет размеченных ролей, поэтому мы не заявляем accuracy и F1. В дальнейшем мы хотим провести исследование с AML-аналитиками и измерить экономию времени. Успешные тесты не означают отсутствие любых ошибок на неизвестных входах.</w:t>
       </w:r>
     </w:p>
     <w:p>
@@ -3039,7 +3041,7 @@
         <w:rPr>
           <w:b w:val="0"/>
         </w:rPr>
-        <w:t>Проверенная среда — Windows и Python 3.12. Docker-конфигурация подготовлена, но сборка контейнера здесь не проверялась. Лимиты входа — 20 000 узлов, 100 000 рёбер и 200 000 операций; скорость на этих предельных размерах не подтверждена.</w:t>
+        <w:t>Мы проверили расчёт в Windows с Python 3.12, собрали и запустили Linux-контейнер Docker, затем разместили приложение в NVIDIA Brev. Лимиты входа — 20 000 узлов, 100 000 рёбер и 200 000 операций; скорость на этих предельных размерах не подтверждена.</w:t>
       </w:r>
     </w:p>
     <w:p>
@@ -3060,7 +3062,7 @@
         <w:rPr>
           <w:b w:val="0"/>
         </w:rPr>
-        <w:t>Пять обязательных функций кейса реализованы: воспроизводимый расчёт, роли и основания для всех узлов, формальные критерии, сообщества, приоритетный список с визуализацией. Дополнительно доступны временная проверка маршрутов, работа с границами данных, справка, чувствительность приоритета и инструменты аналитика.</w:t>
+        <w:t>Мы реализовали пять обязательных функций кейса: воспроизводимый расчёт, роли и основания для всех узлов, формальные критерии, сообщества, приоритетный список с визуализацией. Дополнительно доступны временная проверка маршрутов, работа с границами данных, справка, чувствительность приоритета и инструменты аналитика.</w:t>
       </w:r>
     </w:p>
     <w:tbl>
@@ -3393,13 +3395,13 @@
         <w:rPr>
           <w:b/>
         </w:rPr>
-        <w:t>Перед сдачей.</w:t>
+        <w:t>Как познакомиться с проектом.</w:t>
       </w:r>
       <w:r>
         <w:rPr>
           <w:b w:val="0"/>
         </w:rPr>
-        <w:t xml:space="preserve"> Необходимо проверить доступ жюри к актуальной версии репозитория и развёрнутому приложению, передачу трёх конкурсных файлов, историю прогресса и регламент демонстрации. Наличие функций не гарантирует максимальный балл: оценка зависит от проверяемости и защиты.</w:t>
+        <w:t xml:space="preserve"> Откройте сайт, выберите счёт и проследите его связи до исходных операций. Затем скачайте справку и таблицы. Команды локального запуска и повторного расчёта приведены в README.</w:t>
       </w:r>
     </w:p>
     <w:p>
@@ -3413,7 +3415,7 @@
         <w:rPr>
           <w:b w:val="0"/>
         </w:rPr>
-        <w:t xml:space="preserve"> README.md — запуск, метод и ограничения. USER_GUIDE.md — пошаговая инструкция. PROJECT_FEATURES.md — полный обзор деталей. FOR_JUDGES.md — краткое объяснение. DEMO_SCRIPT.md — сценарий защиты. Код функциональной версии: 78fb39f в ветке codex/graph-money.</w:t>
+        <w:t xml:space="preserve"> README.md — запуск, метод и ограничения. USER_GUIDE.md — пошаговая инструкция. PROJECT_FEATURES.md — полный обзор деталей. FOR_JUDGES.md — краткое объяснение. DEMO_SCRIPT.md — сценарий защиты. Актуальный код и документация находятся в основной ветке main.</w:t>
       </w:r>
     </w:p>
     <w:p>

</xml_diff>

<commit_message>
docs: use impersonal wording for solo project author
</commit_message>
<xml_diff>
--- a/docs/ScreenMentor_Project_Report.docx
+++ b/docs/ScreenMentor_Project_Report.docx
@@ -43,7 +43,7 @@
         <w:drawing>
           <wp:inline xmlns:a="http://schemas.openxmlformats.org/drawingml/2006/main" xmlns:pic="http://schemas.openxmlformats.org/drawingml/2006/picture">
             <wp:extent cx="1224000" cy="1224000"/>
-            <wp:docPr id="1" name="Picture 1" descr="Логотип команды" title="Логотип команды"/>
+            <wp:docPr id="1" name="Picture 1" descr="Логотип проекта" title="Логотип проекта"/>
             <wp:cNvGraphicFramePr>
               <a:graphicFrameLocks noChangeAspect="1"/>
             </wp:cNvGraphicFramePr>
@@ -79,7 +79,7 @@
         <w:rPr>
           <w:b w:val="0"/>
         </w:rPr>
-        <w:t>Мы разработали «Граф денег», чтобы помочь AML-аналитику разобраться в сети переводов. В отчёте показываем, как работает решение, почему мы выбрали такой интерфейс и как проверяем результаты.</w:t>
+        <w:t>Для анализа сети переводов было разработано рабочее место AML-аналитика «Граф денег». В отчёте описаны работа решения, устройство интерфейса и способы проверки результатов.</w:t>
       </w:r>
     </w:p>
     <w:p>
@@ -101,7 +101,7 @@
         <w:rPr>
           <w:b w:val="0"/>
         </w:rPr>
-        <w:t xml:space="preserve"> Мы реализовали основной сценарий и проверили его на полном наборе кейса. Выводы остаются гипотезами: проект помогает выбрать направление проверки и не устанавливает нарушение.</w:t>
+        <w:t xml:space="preserve"> Основной сценарий реализован и проверен на полном наборе кейса. Выводы остаются гипотезами: проект помогает выбрать направление проверки и не устанавливает нарушение.</w:t>
       </w:r>
     </w:p>
     <w:tbl>
@@ -288,7 +288,7 @@
         <w:rPr>
           <w:b w:val="0"/>
         </w:rPr>
-        <w:t>Наш сайт: https://screenmentor-uwfohh6hz.gobrev.dev</w:t>
+        <w:t>Сайт проекта: https://screenmentor-uwfohh6hz.gobrev.dev</w:t>
       </w:r>
     </w:p>
     <w:p>
@@ -690,7 +690,7 @@
         <w:rPr>
           <w:b w:val="0"/>
         </w:rPr>
-        <w:t>Языковая модель в работающем приложении не используется. Локальный помощник отвечает на четыре готовые темы по рассчитанным фактам. При разработке и тестировании мы использовали Codex; зависимости и использованные материалы раскрыты в README.</w:t>
+        <w:t>Языковая модель в работающем приложении не используется. Локальный помощник отвечает на четыре готовые темы по рассчитанным фактам. При разработке и тестировании использовался Codex; зависимости и использованные материалы раскрыты в README.</w:t>
       </w:r>
     </w:p>
     <w:p>
@@ -711,7 +711,7 @@
         <w:rPr>
           <w:b w:val="0"/>
         </w:rPr>
-        <w:t xml:space="preserve">Мы построили экран вокруг трёх действий: </w:t>
+        <w:t xml:space="preserve">Экран построен вокруг трёх действий: </w:t>
       </w:r>
       <w:r>
         <w:rPr>
@@ -803,7 +803,7 @@
         <w:rPr>
           <w:b w:val="0"/>
         </w:rPr>
-        <w:t>Логотип команды расположен в боковой панели и во вкладке браузера. Кнопки дополнены текстовыми названиями; важные состояния описываются словами. Управление вкладками разбора поддерживает стрелки, Home и End. Удобство для профессиональных аналитиков ещё требует отдельного пользовательского исследования.</w:t>
+        <w:t>Логотип проекта расположен в боковой панели и во вкладке браузера. Кнопки дополнены текстовыми названиями; важные состояния описываются словами. Управление вкладками разбора поддерживает стрелки, Home и End. Удобство для профессиональных аналитиков ещё требует отдельного пользовательского исследования.</w:t>
       </w:r>
     </w:p>
     <w:p>
@@ -917,7 +917,7 @@
         <w:rPr>
           <w:b w:val="0"/>
         </w:rPr>
-        <w:t>Мы начинаем обработку с проверки входных файлов. Приложение сверяет схемы, типы, ссылки, уникальность счетов и агрегированных пар, даты, суммы и число переводов. Агрегаты сравниваются с отдельными операциями в целых тиынах.</w:t>
+        <w:t>Обработка начинается с проверки входных файлов. Приложение сверяет схемы, типы, ссылки, уникальность счетов и агрегированных пар, даты, суммы и число переводов. Агрегаты сравниваются с отдельными операциями в целых тиынах.</w:t>
       </w:r>
     </w:p>
     <w:tbl>
@@ -3027,13 +3027,13 @@
         <w:rPr>
           <w:b/>
         </w:rPr>
-        <w:t>Что нам ещё предстоит проверить.</w:t>
+        <w:t>Дальнейшая проверка.</w:t>
       </w:r>
       <w:r>
         <w:rPr>
           <w:b w:val="0"/>
         </w:rPr>
-        <w:t xml:space="preserve"> В наборе нет размеченных ролей, поэтому мы не заявляем accuracy и F1. В дальнейшем мы хотим провести исследование с AML-аналитиками и измерить экономию времени. Успешные тесты не означают отсутствие любых ошибок на неизвестных входах.</w:t>
+        <w:t xml:space="preserve"> В наборе нет размеченных ролей, поэтому accuracy и F1 не заявляются. Для дальнейшей оценки потребуется исследование с AML-аналитиками и измерение экономии времени. Успешные тесты не означают отсутствие любых ошибок на неизвестных входах.</w:t>
       </w:r>
     </w:p>
     <w:p>
@@ -3041,7 +3041,7 @@
         <w:rPr>
           <w:b w:val="0"/>
         </w:rPr>
-        <w:t>Мы проверили расчёт в Windows с Python 3.12, собрали и запустили Linux-контейнер Docker, затем разместили приложение в NVIDIA Brev. Лимиты входа — 20 000 узлов, 100 000 рёбер и 200 000 операций; скорость на этих предельных размерах не подтверждена.</w:t>
+        <w:t>Расчёт проверен в Windows с Python 3.12. Linux-контейнер Docker собран и запущен; приложение размещено в NVIDIA Brev. Лимиты входа — 20 000 узлов, 100 000 рёбер и 200 000 операций; скорость на этих предельных размерах не подтверждена.</w:t>
       </w:r>
     </w:p>
     <w:p>
@@ -3062,7 +3062,7 @@
         <w:rPr>
           <w:b w:val="0"/>
         </w:rPr>
-        <w:t>Мы реализовали пять обязательных функций кейса: воспроизводимый расчёт, роли и основания для всех узлов, формальные критерии, сообщества, приоритетный список с визуализацией. Дополнительно доступны временная проверка маршрутов, работа с границами данных, справка, чувствительность приоритета и инструменты аналитика.</w:t>
+        <w:t>Реализованы пять обязательных функций кейса: воспроизводимый расчёт, роли и основания для всех узлов, формальные критерии, сообщества, приоритетный список с визуализацией. Дополнительно доступны временная проверка маршрутов, работа с границами данных, справка, чувствительность приоритета и инструменты аналитика.</w:t>
       </w:r>
     </w:p>
     <w:tbl>
@@ -3422,9 +3422,8 @@
       <w:r>
         <w:rPr>
           <w:b w:val="0"/>
-          <w:sz w:val="16"/>
         </w:rPr>
-        <w:t>Репозиторий команды: https://github.com/BAITC-Hacks/hack-dea84e5c-screenmentor</w:t>
+        <w:t>Репозиторий проекта: https://github.com/BAITC-Hacks/hack-dea84e5c-screenmentor</w:t>
       </w:r>
     </w:p>
     <w:p>

</xml_diff>